<commit_message>
docs: demo video, refreshed counts and rebuilt report artifacts
Adds the recorded end-to-end walkthrough (tools/demo_video.mjs +
tools/fake_sensor.py sensor simulator), embeds it in the slide deck and
report, and corrects test counts to 61 after the staff-directory
regression tests. Report DOCX/PDF and slides PDF rebuilt.
</commit_message>
<xml_diff>
--- a/docs/report/CSRMS_Report.docx
+++ b/docs/report/CSRMS_Report.docx
@@ -34,32 +34,6 @@
         <w:t xml:space="preserve">August 2026</w:t>
       </w:r>
     </w:p>
-    <w:sdt>
-      <w:sdtPr>
-        <w:docPartObj>
-          <w:docPartGallery w:val="Table of Contents"/>
-          <w:docPartUnique/>
-        </w:docPartObj>
-      </w:sdtPr>
-      <w:sdtContent>
-        <w:p>
-          <w:pPr>
-            <w:pStyle w:val="TOCHeading"/>
-          </w:pPr>
-          <w:r>
-            <w:t xml:space="preserve">Table of Contents</w:t>
-          </w:r>
-        </w:p>
-        <w:p>
-          <w:r>
-            <w:fldChar w:fldCharType="begin" w:dirty="true"/>
-            <w:instrText xml:space="preserve">TOC \o "1-2" \h \z \u</w:instrText>
-            <w:fldChar w:fldCharType="separate"/>
-            <w:fldChar w:fldCharType="end"/>
-          </w:r>
-        </w:p>
-      </w:sdtContent>
-    </w:sdt>
     <w:bookmarkStart w:id="20" w:name="cover-details"/>
     <w:p>
       <w:pPr>
@@ -1604,18 +1578,18 @@
               <w:pStyle w:val="Compact"/>
             </w:pPr>
             <w:r>
-              <w:t xml:space="preserve">list · create · patch · deactivate</w:t>
-            </w:r>
-          </w:p>
-        </w:tc>
-        <w:tc>
-          <w:tcPr/>
-          <w:p>
-            <w:pPr>
-              <w:pStyle w:val="Compact"/>
-            </w:pPr>
-            <w:r>
-              <w:t xml:space="preserve">admin only</w:t>
+              <w:t xml:space="preserve">list · create · patch · deactivate (admin) · assignable-staff directory for the request drawer</w:t>
+            </w:r>
+          </w:p>
+        </w:tc>
+        <w:tc>
+          <w:tcPr/>
+          <w:p>
+            <w:pPr>
+              <w:pStyle w:val="Compact"/>
+            </w:pPr>
+            <w:r>
+              <w:t xml:space="preserve">admin / staff</w:t>
             </w:r>
           </w:p>
         </w:tc>
@@ -2798,18 +2772,18 @@
               <w:pStyle w:val="Compact"/>
             </w:pPr>
             <w:r>
-              <w:t xml:space="preserve">14</w:t>
-            </w:r>
-          </w:p>
-        </w:tc>
-        <w:tc>
-          <w:tcPr/>
-          <w:p>
-            <w:pPr>
-              <w:pStyle w:val="Compact"/>
-            </w:pPr>
-            <w:r>
-              <w:t xml:space="preserve">registration forcing STUDENT, password hashing, token lifecycle, admin user management</w:t>
+              <w:t xml:space="preserve">16</w:t>
+            </w:r>
+          </w:p>
+        </w:tc>
+        <w:tc>
+          <w:tcPr/>
+          <w:p>
+            <w:pPr>
+              <w:pStyle w:val="Compact"/>
+            </w:pPr>
+            <w:r>
+              <w:t xml:space="preserve">registration forcing STUDENT, password hashing, token lifecycle, admin user management, staff directory scoping</w:t>
             </w:r>
           </w:p>
         </w:tc>
@@ -2946,7 +2920,7 @@
                 <w:b/>
                 <w:bCs/>
               </w:rPr>
-              <w:t xml:space="preserve">59</w:t>
+              <w:t xml:space="preserve">61</w:t>
             </w:r>
           </w:p>
         </w:tc>
@@ -3680,7 +3654,40 @@
         <w:t xml:space="preserve"> </w:t>
       </w:r>
       <w:r>
-        <w:t xml:space="preserve">and referenced in the demo script.</w:t>
+        <w:t xml:space="preserve">and referenced in the demo script. A short</w:t>
+      </w:r>
+      <w:r>
+        <w:t xml:space="preserve"> </w:t>
+      </w:r>
+      <w:r>
+        <w:t xml:space="preserve">recorded walkthrough of the full workflow — student report, staff triage, simulated</w:t>
+      </w:r>
+      <w:r>
+        <w:t xml:space="preserve"> </w:t>
+      </w:r>
+      <w:r>
+        <w:t xml:space="preserve">sensors raising a SYSTEM ticket — is committed as</w:t>
+      </w:r>
+      <w:r>
+        <w:t xml:space="preserve"> </w:t>
+      </w:r>
+      <w:r>
+        <w:rPr>
+          <w:rStyle w:val="VerbatimChar"/>
+        </w:rPr>
+        <w:t xml:space="preserve">docs/demo/assets/csrms-demo.mp4</w:t>
+      </w:r>
+      <w:r>
+        <w:t xml:space="preserve"> </w:t>
+      </w:r>
+      <w:r>
+        <w:t xml:space="preserve">and</w:t>
+      </w:r>
+      <w:r>
+        <w:t xml:space="preserve"> </w:t>
+      </w:r>
+      <w:r>
+        <w:t xml:space="preserve">embedded in the slide deck.</w:t>
       </w:r>
     </w:p>
     <w:bookmarkEnd w:id="53"/>
@@ -3811,7 +3818,7 @@
         <w:t xml:space="preserve"> </w:t>
       </w:r>
       <w:r>
-        <w:t xml:space="preserve">— delivered: 59 API/service tests plus firmware scenarios plus a</w:t>
+        <w:t xml:space="preserve">— delivered: 61 API/service tests plus firmware scenarios plus a</w:t>
       </w:r>
       <w:r>
         <w:t xml:space="preserve"> </w:t>
@@ -4513,7 +4520,7 @@
         <w:rPr>
           <w:rStyle w:val="CommentTok"/>
         </w:rPr>
-        <w:t xml:space="preserve"># 59 tests</w:t>
+        <w:t xml:space="preserve"># 61 tests</w:t>
       </w:r>
       <w:r>
         <w:br/>

</xml_diff>